<commit_message>
Chore (doc): update to fix test computer specifications
</commit_message>
<xml_diff>
--- a/docs/Daniel_Ankrah_ZKSnarks_Chapter3.docx
+++ b/docs/Daniel_Ankrah_ZKSnarks_Chapter3.docx
@@ -574,7 +574,67 @@
         <w:rPr>
           <w:lang w:val="en-GB"/>
         </w:rPr>
-        <w:t>● CPU: make/model [specify], core/thread count [specify], base/boost clock [specify]</w:t>
+        <w:t xml:space="preserve">● CPU: </w:t>
+      </w:r>
+      <w:r>
+        <w:rPr>
+          <w:lang w:val="en-GB"/>
+        </w:rPr>
+        <w:t>Intel(R) Core(TM) i5-5300U</w:t>
+      </w:r>
+      <w:r>
+        <w:rPr>
+          <w:lang w:val="en-GB"/>
+        </w:rPr>
+        <w:t xml:space="preserve"> </w:t>
+      </w:r>
+      <w:r>
+        <w:rPr>
+          <w:lang w:val="en-GB"/>
+        </w:rPr>
+        <w:t>@ 2.30GHz</w:t>
+      </w:r>
+      <w:r>
+        <w:rPr>
+          <w:lang w:val="en-GB"/>
+        </w:rPr>
+        <w:t xml:space="preserve">, </w:t>
+      </w:r>
+      <w:r>
+        <w:rPr>
+          <w:lang w:val="en-GB"/>
+        </w:rPr>
+        <w:t xml:space="preserve">2 </w:t>
+      </w:r>
+      <w:r>
+        <w:rPr>
+          <w:lang w:val="en-GB"/>
+        </w:rPr>
+        <w:t xml:space="preserve">cores, </w:t>
+      </w:r>
+      <w:r>
+        <w:rPr>
+          <w:lang w:val="en-GB"/>
+        </w:rPr>
+        <w:t>4</w:t>
+      </w:r>
+      <w:r>
+        <w:rPr>
+          <w:lang w:val="en-GB"/>
+        </w:rPr>
+        <w:t xml:space="preserve"> processors, </w:t>
+      </w:r>
+      <w:r>
+        <w:rPr>
+          <w:lang w:val="en-GB"/>
+        </w:rPr>
+        <w:t>2301</w:t>
+      </w:r>
+      <w:r>
+        <w:rPr>
+          <w:lang w:val="en-GB"/>
+        </w:rPr>
+        <w:t xml:space="preserve"> max clock speed</w:t>
       </w:r>
     </w:p>
     <w:p>
@@ -589,7 +649,7 @@
         <w:rPr>
           <w:lang w:val="en-GB"/>
         </w:rPr>
-        <w:t>● GPU: none — proving runs CPU-only</w:t>
+        <w:t>● GPU: proving runs CPU-only</w:t>
       </w:r>
     </w:p>
     <w:p>
@@ -619,7 +679,25 @@
         <w:rPr>
           <w:lang w:val="en-GB"/>
         </w:rPr>
-        <w:t>● Storage type: [SSD/HDD, specify]</w:t>
+        <w:t xml:space="preserve">● Storage type: HDD, </w:t>
+      </w:r>
+      <w:r>
+        <w:rPr>
+          <w:lang w:val="en-GB"/>
+        </w:rPr>
+        <w:t>120</w:t>
+      </w:r>
+      <w:r>
+        <w:rPr>
+          <w:lang w:val="en-GB"/>
+        </w:rPr>
+        <w:t xml:space="preserve"> </w:t>
+      </w:r>
+      <w:r>
+        <w:rPr>
+          <w:lang w:val="en-GB"/>
+        </w:rPr>
+        <w:t>GB</w:t>
       </w:r>
     </w:p>
     <w:p>
@@ -640,19 +718,19 @@
         <w:rPr>
           <w:lang w:val="en-GB"/>
         </w:rPr>
+        <w:t>v</w:t>
+      </w:r>
+      <w:r>
+        <w:rPr>
+          <w:lang w:val="en-GB"/>
+        </w:rPr>
         <w:t>1.0.0-beta.22</w:t>
       </w:r>
       <w:r>
         <w:rPr>
           <w:lang w:val="en-GB"/>
         </w:rPr>
-        <w:t>+</w:t>
-      </w:r>
-      <w:r>
-        <w:rPr>
-          <w:lang w:val="en-GB"/>
-        </w:rPr>
-        <w:t>c57152f91260ecdb9faad4efc20abb14b6d2ece7</w:t>
+        <w:t>+c57152f91260ecdb9faad4efc20abb14b6d2ece7</w:t>
       </w:r>
     </w:p>
     <w:p>
@@ -668,13 +746,19 @@
           <w:lang w:val="en-GB"/>
         </w:rPr>
         <w:lastRenderedPageBreak/>
-        <w:t>● Nargo version:</w:t>
-      </w:r>
-      <w:r>
-        <w:rPr>
-          <w:lang w:val="en-GB"/>
-        </w:rPr>
-        <w:t xml:space="preserve"> 1.0.0-beta.22</w:t>
+        <w:t xml:space="preserve">● Nargo version: </w:t>
+      </w:r>
+      <w:r>
+        <w:rPr>
+          <w:lang w:val="en-GB"/>
+        </w:rPr>
+        <w:t>v</w:t>
+      </w:r>
+      <w:r>
+        <w:rPr>
+          <w:lang w:val="en-GB"/>
+        </w:rPr>
+        <w:t>1.0.0-beta.22</w:t>
       </w:r>
     </w:p>
     <w:p>
@@ -689,13 +773,13 @@
         <w:rPr>
           <w:lang w:val="en-GB"/>
         </w:rPr>
-        <w:t>● Barretenberg proving backend:</w:t>
-      </w:r>
-      <w:r>
-        <w:rPr>
-          <w:lang w:val="en-GB"/>
-        </w:rPr>
-        <w:t xml:space="preserve"> </w:t>
+        <w:t xml:space="preserve">● Barretenberg proving backend: </w:t>
+      </w:r>
+      <w:r>
+        <w:rPr>
+          <w:lang w:val="en-GB"/>
+        </w:rPr>
+        <w:t>v</w:t>
       </w:r>
       <w:r>
         <w:rPr>
@@ -749,7 +833,13 @@
         <w:rPr>
           <w:lang w:val="en-GB"/>
         </w:rPr>
-        <w:t>● Node.js / Hardhat / Anvil versions: [specify]</w:t>
+        <w:t xml:space="preserve">● Node.js version: </w:t>
+      </w:r>
+      <w:r>
+        <w:rPr>
+          <w:lang w:val="en-GB"/>
+        </w:rPr>
+        <w:t>v26.8.2</w:t>
       </w:r>
     </w:p>
     <w:p>
@@ -812,31 +902,7 @@
         <w:rPr>
           <w:lang w:val="en-GB"/>
         </w:rPr>
-        <w:t xml:space="preserve">A feasibility check must confirm that Scenario 4 </w:t>
-      </w:r>
-      <w:r>
-        <w:rPr>
-          <w:lang w:val="en-GB"/>
-        </w:rPr>
-        <w:t>(</w:t>
-      </w:r>
-      <w:r>
-        <w:rPr>
-          <w:lang w:val="en-GB"/>
-        </w:rPr>
-        <w:t>sixteen attributes with Poseidon hashing and Merkle membership</w:t>
-      </w:r>
-      <w:r>
-        <w:rPr>
-          <w:lang w:val="en-GB"/>
-        </w:rPr>
-        <w:t>)</w:t>
-      </w:r>
-      <w:r>
-        <w:rPr>
-          <w:lang w:val="en-GB"/>
-        </w:rPr>
-        <w:t xml:space="preserve"> compiles and proves within the 8 GB memory budget before the full 30-run protocol is executed. If proving exhausts memory, the failure is an artifact of this hardware choice, not of the circuit and the scenario or the hardware must be revised before data collection begins.</w:t>
+        <w:t>A feasibility check must confirm that Scenario 4 (sixteen attributes with Poseidon hashing and Merkle membership) compiles and proves within the 8 GB memory budget before the full 30-run protocol is executed. If proving exhausts memory, the failure is an artifact of this hardware choice, not of the circuit and the scenario or the hardware must be revised before data collection begins.</w:t>
       </w:r>
     </w:p>
     <w:p>
@@ -1952,13 +2018,7 @@
         <w:rPr>
           <w:lang w:val="en-GB"/>
         </w:rPr>
-        <w:t>Circuit complexity is scaled systematically across four benchmark scenarios, following the distinction between attribute count and predicate logic drawn in Chapter Two. The two dimensions are varied jointly, as a single composite complexity factor, rather than factorially: each scenario is a deliberately coarser "complexity tier" that grows both dimensions together. Accordingly, results are interpreted at the level of the composite scenarios and Chapter Two's framework is read as a conceptual decomposition of complexity rather than as a factorial experimental design. Attributing an observed effect specifically to attribute count or specifically to predicate logic is not claimed</w:t>
-      </w:r>
-      <w:r>
-        <w:rPr>
-          <w:lang w:val="en-GB"/>
-        </w:rPr>
-        <w:t>.</w:t>
+        <w:t>Circuit complexity is scaled systematically across four benchmark scenarios, following the distinction between attribute count and predicate logic drawn in Chapter Two. The two dimensions are varied jointly, as a single composite complexity factor, rather than factorially: each scenario is a deliberately coarser "complexity tier" that grows both dimensions together. Accordingly, results are interpreted at the level of the composite scenarios and Chapter Two's framework is read as a conceptual decomposition of complexity rather than as a factorial experimental design. Attributing an observed effect specifically to attribute count or specifically to predicate logic is not claimed.</w:t>
       </w:r>
     </w:p>
     <w:tbl>
@@ -2818,13 +2878,7 @@
         <w:rPr>
           <w:lang w:val="en-GB"/>
         </w:rPr>
-        <w:t>The verifier contract is generated directly by the ZK toolchain; the code below is only the thin wrapper that keeps the on-chain interface deliberately minimal so that any gas figure recorded can be attributed to the cryptographic verification step itself</w:t>
-      </w:r>
-      <w:r>
-        <w:rPr>
-          <w:lang w:val="en-GB"/>
-        </w:rPr>
-        <w:t>:</w:t>
+        <w:t>The verifier contract is generated directly by the ZK toolchain; the code below is only the thin wrapper that keeps the on-chain interface deliberately minimal so that any gas figure recorded can be attributed to the cryptographic verification step itself:</w:t>
       </w:r>
     </w:p>
     <w:p>
@@ -2866,25 +2920,7 @@
           <w:szCs w:val="20"/>
           <w:lang w:val="en-GB"/>
         </w:rPr>
-        <w:t>pragma solidity ^0.8.2</w:t>
-      </w:r>
-      <w:r>
-        <w:rPr>
-          <w:rFonts w:ascii="Courier New" w:hAnsi="Courier New" w:cs="Courier New"/>
-          <w:sz w:val="20"/>
-          <w:szCs w:val="20"/>
-          <w:lang w:val="en-GB"/>
-        </w:rPr>
-        <w:t>1</w:t>
-      </w:r>
-      <w:r>
-        <w:rPr>
-          <w:rFonts w:ascii="Courier New" w:hAnsi="Courier New" w:cs="Courier New"/>
-          <w:sz w:val="20"/>
-          <w:szCs w:val="20"/>
-          <w:lang w:val="en-GB"/>
-        </w:rPr>
-        <w:t>;</w:t>
+        <w:t>pragma solidity ^0.8.21;</w:t>
       </w:r>
     </w:p>
     <w:p>
@@ -5286,25 +5322,7 @@
           <w:lang w:val="en-GB"/>
         </w:rPr>
         <w:lastRenderedPageBreak/>
-        <w:t>3.11.</w:t>
-      </w:r>
-      <w:r>
-        <w:rPr>
-          <w:b/>
-          <w:bCs/>
-          <w:color w:val="000000"/>
-          <w:lang w:val="en-GB"/>
-        </w:rPr>
-        <w:t>5</w:t>
-      </w:r>
-      <w:r>
-        <w:rPr>
-          <w:b/>
-          <w:bCs/>
-          <w:color w:val="000000"/>
-          <w:lang w:val="en-GB"/>
-        </w:rPr>
-        <w:t xml:space="preserve"> Comparative Interpretation Against Secure Multi-Party Computation</w:t>
+        <w:t>3.11.5 Comparative Interpretation Against Secure Multi-Party Computation</w:t>
       </w:r>
     </w:p>
     <w:p>
@@ -5628,25 +5646,7 @@
         <w:rPr>
           <w:lang w:val="en-GB"/>
         </w:rPr>
-        <w:t xml:space="preserve"> </w:t>
-      </w:r>
-      <w:r>
-        <w:rPr>
-          <w:lang w:val="en-GB"/>
-        </w:rPr>
-        <w:t xml:space="preserve">and a </w:t>
-      </w:r>
-      <w:r>
-        <w:rPr>
-          <w:lang w:val="en-GB"/>
-        </w:rPr>
-        <w:t>pre-stage</w:t>
-      </w:r>
-      <w:r>
-        <w:rPr>
-          <w:lang w:val="en-GB"/>
-        </w:rPr>
-        <w:t xml:space="preserve"> feasibility check before the full measurement protocol</w:t>
+        <w:t xml:space="preserve"> and a pre-stage feasibility check before the full measurement protocol</w:t>
       </w:r>
       <w:r>
         <w:rPr>
@@ -7061,6 +7061,7 @@
   <w:style w:type="character" w:default="1" w:styleId="DefaultParagraphFont">
     <w:name w:val="Default Paragraph Font"/>
     <w:uiPriority w:val="1"/>
+    <w:semiHidden/>
     <w:unhideWhenUsed/>
   </w:style>
   <w:style w:type="table" w:default="1" w:styleId="TableNormal">

</xml_diff>

<commit_message>
Chore (docs): updated Chapter 3 and added Chapter 4
</commit_message>
<xml_diff>
--- a/docs/Daniel_Ankrah_ZKSnarks_Chapter3.docx
+++ b/docs/Daniel_Ankrah_ZKSnarks_Chapter3.docx
@@ -85,31 +85,7 @@
         <w:rPr>
           <w:lang w:val="en-GB"/>
         </w:rPr>
-        <w:t>The evaluation framework measures off-chain computational resource consumption</w:t>
-      </w:r>
-      <w:r>
-        <w:rPr>
-          <w:lang w:val="en-GB"/>
-        </w:rPr>
-        <w:t xml:space="preserve">, </w:t>
-      </w:r>
-      <w:r>
-        <w:rPr>
-          <w:lang w:val="en-GB"/>
-        </w:rPr>
-        <w:t>compilation time, witness-generation time, proving time, and peak memory</w:t>
-      </w:r>
-      <w:r>
-        <w:rPr>
-          <w:lang w:val="en-GB"/>
-        </w:rPr>
-        <w:t xml:space="preserve">, </w:t>
-      </w:r>
-      <w:r>
-        <w:rPr>
-          <w:lang w:val="en-GB"/>
-        </w:rPr>
-        <w:t>alongside on-chain execution overhead, namely EVM gas consumption and transaction calldata size, across credential and circuit configurations of increasing complexity. Every software configuration, cryptographic proving backend, compilation pipeline, and piece of underlying hardware is fixed and documented in advance, in line with established guidance on reproducible performance benchmarking (Georges, Buytaert, &amp; Eeckhout, 2007).</w:t>
+        <w:t>The evaluation framework measures off-chain computational resource consumption, compilation time, witness-generation time, proving time, and peak memory, alongside on-chain execution overhead, namely EVM gas consumption and transaction calldata size, across credential and circuit configurations of increasing complexity. Every software configuration, cryptographic proving backend, compilation pipeline, and piece of underlying hardware is fixed and documented in advance, in line with established guidance on reproducible performance benchmarking (Georges, Buytaert, &amp; Eeckhout, 2007).</w:t>
       </w:r>
     </w:p>
     <w:p>
@@ -164,19 +140,7 @@
           <w:lang w:val="en-GB"/>
         </w:rPr>
         <w:lastRenderedPageBreak/>
-        <w:t xml:space="preserve">complexity of an attribute-based credential circuit is associated with changes in proof-generation time, peak memory consumption, proof size, verification time, circuit size, transaction calldata, and Ethereum gas consumption. Positivism is particularly well suited to software performance benchmarking of this kind because the underlying measurements can be repeated under controlled conditions and </w:t>
-      </w:r>
-      <w:r>
-        <w:rPr>
-          <w:lang w:val="en-GB"/>
-        </w:rPr>
-        <w:t>summarized</w:t>
-      </w:r>
-      <w:r>
-        <w:rPr>
-          <w:lang w:val="en-GB"/>
-        </w:rPr>
-        <w:t xml:space="preserve"> statistically with a fair degree of confidence (Easterbrook, Singer, Storey, &amp; Damian, 2008).</w:t>
+        <w:t>complexity of an attribute-based credential circuit is associated with changes in proof-generation time, peak memory consumption, proof size, verification time, circuit size, transaction calldata, and Ethereum gas consumption. Positivism is particularly well suited to software performance benchmarking of this kind because the underlying measurements can be repeated under controlled conditions and summarized statistically with a fair degree of confidence (Easterbrook, Singer, Storey, &amp; Damian, 2008).</w:t>
       </w:r>
     </w:p>
     <w:p>
@@ -224,19 +188,7 @@
         <w:rPr>
           <w:lang w:val="en-GB"/>
         </w:rPr>
-        <w:t xml:space="preserve">These quantitative measurements are subsequently </w:t>
-      </w:r>
-      <w:r>
-        <w:rPr>
-          <w:lang w:val="en-GB"/>
-        </w:rPr>
-        <w:t>analysed</w:t>
-      </w:r>
-      <w:r>
-        <w:rPr>
-          <w:lang w:val="en-GB"/>
-        </w:rPr>
-        <w:t xml:space="preserve"> using descriptive statistics and, where the data justify it, inferential statistical techniques such as correlation and regression, discussed further in Section 3.11.</w:t>
+        <w:t>These quantitative measurements are subsequently analysed using descriptive statistics and, where the data justify it, inferential statistical techniques such as correlation and regression, discussed further in Section 3.11.</w:t>
       </w:r>
     </w:p>
     <w:p>
@@ -287,27 +239,7 @@
           <w:iCs/>
           <w:lang w:val="en-GB"/>
         </w:rPr>
-        <w:t>Credential/circuit complexity → circuit characteristics → proving and verification</w:t>
-      </w:r>
-      <w:r>
-        <w:rPr>
-          <w:b/>
-          <w:bCs/>
-          <w:i/>
-          <w:iCs/>
-          <w:lang w:val="en-GB"/>
-        </w:rPr>
-        <w:t xml:space="preserve"> </w:t>
-      </w:r>
-      <w:r>
-        <w:rPr>
-          <w:b/>
-          <w:bCs/>
-          <w:i/>
-          <w:iCs/>
-          <w:lang w:val="en-GB"/>
-        </w:rPr>
-        <w:t>performance → blockchain verification cost</w:t>
+        <w:t>Credential/circuit complexity → circuit characteristics → proving and verification performance → blockchain verification cost</w:t>
       </w:r>
     </w:p>
     <w:p>
@@ -318,41 +250,12 @@
           <w:lang w:val="en-GB"/>
         </w:rPr>
       </w:pPr>
-    </w:p>
-    <w:p>
-      <w:pPr>
-        <w:spacing w:after="200" w:line="360" w:lineRule="auto"/>
-        <w:jc w:val="both"/>
-        <w:rPr>
-          <w:lang w:val="en-GB"/>
-        </w:rPr>
-      </w:pPr>
-    </w:p>
-    <w:p>
-      <w:pPr>
-        <w:spacing w:after="200" w:line="360" w:lineRule="auto"/>
-        <w:jc w:val="both"/>
-        <w:rPr>
-          <w:lang w:val="en-GB"/>
-        </w:rPr>
-      </w:pPr>
-      <w:r>
-        <w:rPr>
-          <w:lang w:val="en-GB"/>
-        </w:rPr>
-        <w:t xml:space="preserve">The study is </w:t>
-      </w:r>
-      <w:r>
-        <w:rPr>
-          <w:lang w:val="en-GB"/>
-        </w:rPr>
-        <w:t>organized</w:t>
-      </w:r>
-      <w:r>
-        <w:rPr>
-          <w:lang w:val="en-GB"/>
-        </w:rPr>
-        <w:t xml:space="preserve"> into four major stages:</w:t>
+      <w:r>
+        <w:rPr>
+          <w:lang w:val="en-GB"/>
+        </w:rPr>
+        <w:lastRenderedPageBreak/>
+        <w:t>The study is organized into four major stages:</w:t>
       </w:r>
     </w:p>
     <w:p>
@@ -373,19 +276,7 @@
         <w:rPr>
           <w:lang w:val="en-GB"/>
         </w:rPr>
-        <w:t>Stage 1</w:t>
-      </w:r>
-      <w:r>
-        <w:rPr>
-          <w:lang w:val="en-GB"/>
-        </w:rPr>
-        <w:t xml:space="preserve"> - </w:t>
-      </w:r>
-      <w:r>
-        <w:rPr>
-          <w:lang w:val="en-GB"/>
-        </w:rPr>
-        <w:t>System specification: the attribute-based credential model and its verification requirements are defined precisely enough to be implemented without ambiguity.</w:t>
+        <w:t>Stage 1 - System specification: the attribute-based credential model and its verification requirements are defined precisely enough to be implemented without ambiguity.</w:t>
       </w:r>
     </w:p>
     <w:p>
@@ -406,19 +297,7 @@
         <w:rPr>
           <w:lang w:val="en-GB"/>
         </w:rPr>
-        <w:t xml:space="preserve">Stage 2 </w:t>
-      </w:r>
-      <w:r>
-        <w:rPr>
-          <w:lang w:val="en-GB"/>
-        </w:rPr>
-        <w:t>-</w:t>
-      </w:r>
-      <w:r>
-        <w:rPr>
-          <w:lang w:val="en-GB"/>
-        </w:rPr>
-        <w:t xml:space="preserve"> ZK circuit implementation: the credential-verification logic is implemented in Noir.</w:t>
+        <w:t>Stage 2 - ZK circuit implementation: the credential-verification logic is implemented in Noir.</w:t>
       </w:r>
     </w:p>
     <w:p>
@@ -439,19 +318,7 @@
         <w:rPr>
           <w:lang w:val="en-GB"/>
         </w:rPr>
-        <w:t xml:space="preserve">Stage 3 </w:t>
-      </w:r>
-      <w:r>
-        <w:rPr>
-          <w:lang w:val="en-GB"/>
-        </w:rPr>
-        <w:t>-</w:t>
-      </w:r>
-      <w:r>
-        <w:rPr>
-          <w:lang w:val="en-GB"/>
-        </w:rPr>
-        <w:t xml:space="preserve"> Experimental benchmarking: the implementation is executed under controlled conditions while every relevant measurement is collected.</w:t>
+        <w:t>Stage 3 - Experimental benchmarking: the implementation is executed under controlled conditions while every relevant measurement is collected.</w:t>
       </w:r>
     </w:p>
     <w:p>
@@ -472,19 +339,7 @@
         <w:rPr>
           <w:lang w:val="en-GB"/>
         </w:rPr>
-        <w:t xml:space="preserve">Stage 4 </w:t>
-      </w:r>
-      <w:r>
-        <w:rPr>
-          <w:lang w:val="en-GB"/>
-        </w:rPr>
-        <w:t>-</w:t>
-      </w:r>
-      <w:r>
-        <w:rPr>
-          <w:lang w:val="en-GB"/>
-        </w:rPr>
-        <w:t xml:space="preserve"> Ethereum verification: the generated proofs are verified through an Ethereum-compatible smart-contract environment, and the resulting execution costs are measured.</w:t>
+        <w:t>Stage 4 - Ethereum verification: the generated proofs are verified through an Ethereum-compatible smart-contract environment, and the resulting execution costs are measured.</w:t>
       </w:r>
     </w:p>
     <w:p>
@@ -499,19 +354,7 @@
         <w:rPr>
           <w:lang w:val="en-GB"/>
         </w:rPr>
-        <w:t xml:space="preserve">This four-stage design lets the study cleanly separate the computational burden borne by the prover from the cost borne by the blockchain verifier </w:t>
-      </w:r>
-      <w:r>
-        <w:rPr>
-          <w:lang w:val="en-GB"/>
-        </w:rPr>
-        <w:t>-</w:t>
-      </w:r>
-      <w:r>
-        <w:rPr>
-          <w:lang w:val="en-GB"/>
-        </w:rPr>
-        <w:t xml:space="preserve"> a distinction the literature reviewed in Chapter Two shows is easy to blur but important to keep apart (Guo, Feng, Wu, Li, &amp; Xu, 2024).</w:t>
+        <w:t>This four-stage design lets the study cleanly separate the computational burden borne by the prover from the cost borne by the blockchain verifier - a distinction the literature reviewed in Chapter Two shows is easy to blur but important to keep apart (Guo, Feng, Wu, Li, &amp; Xu, 2024).</w:t>
       </w:r>
     </w:p>
     <w:p>
@@ -559,7 +402,7 @@
         <w:rPr>
           <w:lang w:val="en-GB"/>
         </w:rPr>
-        <w:t>● Host OS: Linux Ubuntu 24.04 LTS (64-bit)</w:t>
+        <w:t>● Host OS: Windows 11 Pro (64-bit), with the benchmark toolchain executed inside a WSL2 Ubuntu 26.04.3 LTS environment</w:t>
       </w:r>
     </w:p>
     <w:p>
@@ -574,67 +417,7 @@
         <w:rPr>
           <w:lang w:val="en-GB"/>
         </w:rPr>
-        <w:t xml:space="preserve">● CPU: </w:t>
-      </w:r>
-      <w:r>
-        <w:rPr>
-          <w:lang w:val="en-GB"/>
-        </w:rPr>
-        <w:t>Intel(R) Core(TM) i5-5300U</w:t>
-      </w:r>
-      <w:r>
-        <w:rPr>
-          <w:lang w:val="en-GB"/>
-        </w:rPr>
-        <w:t xml:space="preserve"> </w:t>
-      </w:r>
-      <w:r>
-        <w:rPr>
-          <w:lang w:val="en-GB"/>
-        </w:rPr>
-        <w:t>@ 2.30GHz</w:t>
-      </w:r>
-      <w:r>
-        <w:rPr>
-          <w:lang w:val="en-GB"/>
-        </w:rPr>
-        <w:t xml:space="preserve">, </w:t>
-      </w:r>
-      <w:r>
-        <w:rPr>
-          <w:lang w:val="en-GB"/>
-        </w:rPr>
-        <w:t xml:space="preserve">2 </w:t>
-      </w:r>
-      <w:r>
-        <w:rPr>
-          <w:lang w:val="en-GB"/>
-        </w:rPr>
-        <w:t xml:space="preserve">cores, </w:t>
-      </w:r>
-      <w:r>
-        <w:rPr>
-          <w:lang w:val="en-GB"/>
-        </w:rPr>
-        <w:t>4</w:t>
-      </w:r>
-      <w:r>
-        <w:rPr>
-          <w:lang w:val="en-GB"/>
-        </w:rPr>
-        <w:t xml:space="preserve"> processors, </w:t>
-      </w:r>
-      <w:r>
-        <w:rPr>
-          <w:lang w:val="en-GB"/>
-        </w:rPr>
-        <w:t>2301</w:t>
-      </w:r>
-      <w:r>
-        <w:rPr>
-          <w:lang w:val="en-GB"/>
-        </w:rPr>
-        <w:t xml:space="preserve"> max clock speed</w:t>
+        <w:t>● CPU: Intel(R) Core(TM) i5-5300U @ 2.30GHz, 2 cores, 4 processors, 2301 max clock speed</w:t>
       </w:r>
     </w:p>
     <w:p>
@@ -664,7 +447,7 @@
         <w:rPr>
           <w:lang w:val="en-GB"/>
         </w:rPr>
-        <w:t>● System memory: 8 GB DDR5</w:t>
+        <w:t>● System memory: 8 GB physical host RAM; 6 GB allocated to the WSL2 benchmark environment (memory generation not independently verified – DDR5 is not applicable to this 2015-era CPU)</w:t>
       </w:r>
     </w:p>
     <w:p>
@@ -679,25 +462,7 @@
         <w:rPr>
           <w:lang w:val="en-GB"/>
         </w:rPr>
-        <w:t xml:space="preserve">● Storage type: HDD, </w:t>
-      </w:r>
-      <w:r>
-        <w:rPr>
-          <w:lang w:val="en-GB"/>
-        </w:rPr>
-        <w:t>120</w:t>
-      </w:r>
-      <w:r>
-        <w:rPr>
-          <w:lang w:val="en-GB"/>
-        </w:rPr>
-        <w:t xml:space="preserve"> </w:t>
-      </w:r>
-      <w:r>
-        <w:rPr>
-          <w:lang w:val="en-GB"/>
-        </w:rPr>
-        <w:t>GB</w:t>
+        <w:t>● Storage type: HDD, 120 GB</w:t>
       </w:r>
     </w:p>
     <w:p>
@@ -712,25 +477,7 @@
         <w:rPr>
           <w:lang w:val="en-GB"/>
         </w:rPr>
-        <w:t xml:space="preserve">● Noir compiler version: </w:t>
-      </w:r>
-      <w:r>
-        <w:rPr>
-          <w:lang w:val="en-GB"/>
-        </w:rPr>
-        <w:t>v</w:t>
-      </w:r>
-      <w:r>
-        <w:rPr>
-          <w:lang w:val="en-GB"/>
-        </w:rPr>
-        <w:t>1.0.0-beta.22</w:t>
-      </w:r>
-      <w:r>
-        <w:rPr>
-          <w:lang w:val="en-GB"/>
-        </w:rPr>
-        <w:t>+c57152f91260ecdb9faad4efc20abb14b6d2ece7</w:t>
+        <w:t>● Noir compiler version: v1.0.0-beta.22+c57152f91260ecdb9faad4efc20abb14b6d2ece7</w:t>
       </w:r>
     </w:p>
     <w:p>
@@ -746,19 +493,7 @@
           <w:lang w:val="en-GB"/>
         </w:rPr>
         <w:lastRenderedPageBreak/>
-        <w:t xml:space="preserve">● Nargo version: </w:t>
-      </w:r>
-      <w:r>
-        <w:rPr>
-          <w:lang w:val="en-GB"/>
-        </w:rPr>
-        <w:t>v</w:t>
-      </w:r>
-      <w:r>
-        <w:rPr>
-          <w:lang w:val="en-GB"/>
-        </w:rPr>
-        <w:t>1.0.0-beta.22</w:t>
+        <w:t>● Nargo version: v1.0.0-beta.22</w:t>
       </w:r>
     </w:p>
     <w:p>
@@ -773,19 +508,7 @@
         <w:rPr>
           <w:lang w:val="en-GB"/>
         </w:rPr>
-        <w:t xml:space="preserve">● Barretenberg proving backend: </w:t>
-      </w:r>
-      <w:r>
-        <w:rPr>
-          <w:lang w:val="en-GB"/>
-        </w:rPr>
-        <w:t>v</w:t>
-      </w:r>
-      <w:r>
-        <w:rPr>
-          <w:lang w:val="en-GB"/>
-        </w:rPr>
-        <w:t>5.0.0-nightly.20260522</w:t>
+        <w:t>● Barretenberg proving backend: v5.0.0-nightly.20260522</w:t>
       </w:r>
     </w:p>
     <w:p>
@@ -800,25 +523,7 @@
         <w:rPr>
           <w:lang w:val="en-GB"/>
         </w:rPr>
-        <w:t xml:space="preserve">● Solidity compiler (solc): </w:t>
-      </w:r>
-      <w:r>
-        <w:rPr>
-          <w:lang w:val="en-GB"/>
-        </w:rPr>
-        <w:t xml:space="preserve">≥ </w:t>
-      </w:r>
-      <w:r>
-        <w:rPr>
-          <w:lang w:val="en-GB"/>
-        </w:rPr>
-        <w:t>v0.8.2</w:t>
-      </w:r>
-      <w:r>
-        <w:rPr>
-          <w:lang w:val="en-GB"/>
-        </w:rPr>
-        <w:t>1</w:t>
+        <w:t>● Solidity compiler (solc): ≥ v0.8.21</w:t>
       </w:r>
     </w:p>
     <w:p>
@@ -833,13 +538,7 @@
         <w:rPr>
           <w:lang w:val="en-GB"/>
         </w:rPr>
-        <w:t xml:space="preserve">● Node.js version: </w:t>
-      </w:r>
-      <w:r>
-        <w:rPr>
-          <w:lang w:val="en-GB"/>
-        </w:rPr>
-        <w:t>v26.8.2</w:t>
+        <w:t>● Node.js version: v26.8.2</w:t>
       </w:r>
     </w:p>
     <w:p>
@@ -854,13 +553,7 @@
         <w:rPr>
           <w:lang w:val="en-GB"/>
         </w:rPr>
-        <w:t>● SRS provisioning: the Barretenberg universal structured reference string is downloaded and cached identically before every run</w:t>
-      </w:r>
-      <w:r>
-        <w:rPr>
-          <w:lang w:val="en-GB"/>
-        </w:rPr>
-        <w:t>.</w:t>
+        <w:t>● SRS provisioning: the Barretenberg universal structured reference string is downloaded and cached identically before every run.</w:t>
       </w:r>
     </w:p>
     <w:p>
@@ -875,19 +568,7 @@
         <w:rPr>
           <w:lang w:val="en-GB"/>
         </w:rPr>
-        <w:t>Locking these versions matters more than it might first appear: Noir's own documentation notes that ACIR operation counts only approximate a backend's true proving cost, and that circuit size and gate structure need to be inspected directly rather than assumed</w:t>
-      </w:r>
-      <w:r>
-        <w:rPr>
-          <w:lang w:val="en-GB"/>
-        </w:rPr>
-        <w:t>,</w:t>
-      </w:r>
-      <w:r>
-        <w:rPr>
-          <w:lang w:val="en-GB"/>
-        </w:rPr>
-        <w:t xml:space="preserve"> which means a change in compiler or backend version part-way through data collection could quietly invalidate a comparison between scenarios that was never meant to measure that change at all.</w:t>
+        <w:t>Locking these versions matters more than it might first appear: Noir's own documentation notes that ACIR operation counts only approximate a backend's true proving cost, and that circuit size and gate structure need to be inspected directly rather than assumed, which means a change in compiler or backend version part-way through data collection could quietly invalidate a comparison between scenarios that was never meant to measure that change at all.</w:t>
       </w:r>
     </w:p>
     <w:p>
@@ -1725,43 +1406,7 @@
         <w:rPr>
           <w:lang w:val="en-GB"/>
         </w:rPr>
-        <w:t>The experimental architecture models a privacy-preserving Attribute-Based Credential (ABC) lifecycle across three core entities</w:t>
-      </w:r>
-      <w:r>
-        <w:rPr>
-          <w:lang w:val="en-GB"/>
-        </w:rPr>
-        <w:t xml:space="preserve">, </w:t>
-      </w:r>
-      <w:r>
-        <w:rPr>
-          <w:lang w:val="en-GB"/>
-        </w:rPr>
-        <w:t xml:space="preserve">the Issuer, the Holder (acting as prover), and the Verifier, here implemented as an Ethereum smart contract. This three-party structure mirrors the issuer-holder-verifier model </w:t>
-      </w:r>
-      <w:r>
-        <w:rPr>
-          <w:lang w:val="en-GB"/>
-        </w:rPr>
-        <w:t>formalized</w:t>
-      </w:r>
-      <w:r>
-        <w:rPr>
-          <w:lang w:val="en-GB"/>
-        </w:rPr>
-        <w:t xml:space="preserve"> in the W3C Verifiable Credentials Data Model 2.0 (World Wide Web Consortium [W3C], 2025), which keeps the experimental design anchored to a real, </w:t>
-      </w:r>
-      <w:r>
-        <w:rPr>
-          <w:lang w:val="en-GB"/>
-        </w:rPr>
-        <w:t>standardized</w:t>
-      </w:r>
-      <w:r>
-        <w:rPr>
-          <w:lang w:val="en-GB"/>
-        </w:rPr>
-        <w:t xml:space="preserve"> credential model rather than an artificial one invented purely for benchmarking convenience.</w:t>
+        <w:t>The experimental architecture models a privacy-preserving Attribute-Based Credential (ABC) lifecycle across three core entities, the Issuer, the Holder (acting as prover), and the Verifier, here implemented as an Ethereum smart contract. This three-party structure mirrors the issuer-holder-verifier model formalized in the W3C Verifiable Credentials Data Model 2.0 (World Wide Web Consortium [W3C], 2025), which keeps the experimental design anchored to a real, standardized credential model rather than an artificial one invented purely for benchmarking convenience.</w:t>
       </w:r>
     </w:p>
     <w:p>
@@ -1794,19 +1439,7 @@
         <w:rPr>
           <w:lang w:val="en-GB"/>
         </w:rPr>
-        <w:t xml:space="preserve">The complete experimental lifecycle proceeds through </w:t>
-      </w:r>
-      <w:r>
-        <w:rPr>
-          <w:lang w:val="en-GB"/>
-        </w:rPr>
-        <w:t>the following</w:t>
-      </w:r>
-      <w:r>
-        <w:rPr>
-          <w:lang w:val="en-GB"/>
-        </w:rPr>
-        <w:t xml:space="preserve"> sequential stages:</w:t>
+        <w:t>The complete experimental lifecycle proceeds through the following sequential stages:</w:t>
       </w:r>
     </w:p>
     <w:p>
@@ -1827,19 +1460,7 @@
         <w:rPr>
           <w:lang w:val="en-GB"/>
         </w:rPr>
-        <w:t>Feasibility and pilot check: before the full protocol, each scenario is compiled and proven once end-to-end to confirm it fits the hardware budget (particularly Scenario 4 within 8 GB RAM), that the SRS is provisioned</w:t>
-      </w:r>
-      <w:r>
-        <w:rPr>
-          <w:lang w:val="en-GB"/>
-        </w:rPr>
-        <w:t>,</w:t>
-      </w:r>
-      <w:r>
-        <w:rPr>
-          <w:lang w:val="en-GB"/>
-        </w:rPr>
-        <w:t xml:space="preserve"> and that the full pipeline runs to completion.</w:t>
+        <w:t>Feasibility and pilot check: before the full protocol, each scenario is compiled and proven once end-to-end to confirm it fits the hardware budget (particularly Scenario 4 within 8 GB RAM), that the SRS is provisioned, and that the full pipeline runs to completion.</w:t>
       </w:r>
     </w:p>
     <w:p>
@@ -1966,19 +1587,7 @@
           <w:lang w:val="en-GB"/>
         </w:rPr>
         <w:lastRenderedPageBreak/>
-        <w:t xml:space="preserve">Data validation, statistical analysis, and interpretation: run status is validated, descriptive statistics are computed, metric distributions are examined, off-chain versus on-chain scaling is </w:t>
-      </w:r>
-      <w:r>
-        <w:rPr>
-          <w:lang w:val="en-GB"/>
-        </w:rPr>
-        <w:t>analysed</w:t>
-      </w:r>
-      <w:r>
-        <w:rPr>
-          <w:lang w:val="en-GB"/>
-        </w:rPr>
-        <w:t>, and findings are reported.</w:t>
+        <w:t>Data validation, statistical analysis, and interpretation: run status is validated, descriptive statistics are computed, metric distributions are examined, off-chain versus on-chain scaling is analysed, and findings are reported.</w:t>
       </w:r>
       <w:r>
         <w:rPr>
@@ -2833,19 +2442,7 @@
         <w:rPr>
           <w:lang w:val="en-GB"/>
         </w:rPr>
-        <w:t>The primary gas evaluation is conducted in a controlled, local Ethereum-compatible environment rather than on a public network. A local environment is deterministic, avoids the variability introduced by public network congestion, requires no real funds, allows the chain state to be reset between runs, and supports precise, reproducible gas measurement</w:t>
-      </w:r>
-      <w:r>
-        <w:rPr>
-          <w:lang w:val="en-GB"/>
-        </w:rPr>
-        <w:t xml:space="preserve">, </w:t>
-      </w:r>
-      <w:r>
-        <w:rPr>
-          <w:lang w:val="en-GB"/>
-        </w:rPr>
-        <w:t>all properties that a live network cannot guarantee, since gas pricing and inclusion on a public chain are shaped by market conditions rather than by the experiment itself (Wood, 2024). A public testnet may be used for supplementary validation, but any figures drawn from it are strictly distinguished from the controlled local gas measurements that form the study's primary dataset.</w:t>
+        <w:t>The primary gas evaluation is conducted in a controlled, local Ethereum-compatible environment rather than on a public network. A local environment is deterministic, avoids the variability introduced by public network congestion, requires no real funds, allows the chain state to be reset between runs, and supports precise, reproducible gas measurement, all properties that a live network cannot guarantee, since gas pricing and inclusion on a public chain are shaped by market conditions rather than by the experiment itself (Wood, 2024). A public testnet may be used for supplementary validation, but any figures drawn from it are strictly distinguished from the controlled local gas measurements that form the study's primary dataset.</w:t>
       </w:r>
     </w:p>
     <w:p>
@@ -3296,31 +2893,7 @@
         <w:rPr>
           <w:lang w:val="en-GB"/>
         </w:rPr>
-        <w:t xml:space="preserve">Verification gas is isolated from total transaction gas rather than read whole from the receipt. The verifier call is instrumented with gasleft snapshots inside the contract so that the gas consumed by the verification procedure alone is recorded, and the calldata component </w:t>
-      </w:r>
-      <w:r>
-        <w:rPr>
-          <w:lang w:val="en-GB"/>
-        </w:rPr>
-        <w:t>(</w:t>
-      </w:r>
-      <w:r>
-        <w:rPr>
-          <w:lang w:val="en-GB"/>
-        </w:rPr>
-        <w:t>4 gas per zero byte and 16 gas per non-zero byte of the submitted payload under the current fee schedule</w:t>
-      </w:r>
-      <w:r>
-        <w:rPr>
-          <w:lang w:val="en-GB"/>
-        </w:rPr>
-        <w:t>)</w:t>
-      </w:r>
-      <w:r>
-        <w:rPr>
-          <w:lang w:val="en-GB"/>
-        </w:rPr>
-        <w:t xml:space="preserve"> is computed separately and reported alongside, not conflated with, the cryptographic verification cost.</w:t>
+        <w:t>Verification gas is isolated from total transaction gas rather than read whole from the receipt. The verifier call is instrumented with gasleft snapshots inside the contract so that the gas consumed by the verification procedure alone is recorded, and the calldata component (4 gas per zero byte and 16 gas per non-zero byte of the submitted payload under the current fee schedule) is computed separately and reported alongside, not conflated with, the cryptographic verification cost.</w:t>
       </w:r>
     </w:p>
     <w:p>
@@ -4956,19 +4529,7 @@
         <w:rPr>
           <w:lang w:val="en-GB"/>
         </w:rPr>
-        <w:t xml:space="preserve">For each benchmark scenario, quantitative measurements are </w:t>
-      </w:r>
-      <w:r>
-        <w:rPr>
-          <w:lang w:val="en-GB"/>
-        </w:rPr>
-        <w:t>summarized</w:t>
-      </w:r>
-      <w:r>
-        <w:rPr>
-          <w:lang w:val="en-GB"/>
-        </w:rPr>
-        <w:t xml:space="preserve"> using the mean, median, minimum, maximum, standard deviation, and coefficient of variation. Reporting the full spread, rather than the mean alone, matters because proving time and memory use on shared hardware are known to vary between otherwise identical runs (Georges et al., 2007).</w:t>
+        <w:t>For each benchmark scenario, quantitative measurements are summarized using the mean, median, minimum, maximum, standard deviation, and coefficient of variation. Reporting the full spread, rather than the mean alone, matters because proving time and memory use on shared hardware are known to vary between otherwise identical runs (Georges et al., 2007).</w:t>
       </w:r>
     </w:p>
     <w:p>
@@ -5083,19 +4644,7 @@
         <w:rPr>
           <w:lang w:val="en-GB"/>
         </w:rPr>
-        <w:t xml:space="preserve">Attribute count </w:t>
-      </w:r>
-      <w:r>
-        <w:rPr>
-          <w:lang w:val="en-GB"/>
-        </w:rPr>
-        <w:t>-</w:t>
-      </w:r>
-      <w:r>
-        <w:rPr>
-          <w:lang w:val="en-GB"/>
-        </w:rPr>
-        <w:t xml:space="preserve"> peak memory</w:t>
+        <w:t>Attribute count - peak memory</w:t>
       </w:r>
     </w:p>
     <w:p>
@@ -5116,19 +4665,7 @@
         <w:rPr>
           <w:lang w:val="en-GB"/>
         </w:rPr>
-        <w:t xml:space="preserve">Circuit size </w:t>
-      </w:r>
-      <w:r>
-        <w:rPr>
-          <w:lang w:val="en-GB"/>
-        </w:rPr>
-        <w:t>-</w:t>
-      </w:r>
-      <w:r>
-        <w:rPr>
-          <w:lang w:val="en-GB"/>
-        </w:rPr>
-        <w:t xml:space="preserve"> proof-generation time</w:t>
+        <w:t>Circuit size - proof-generation time</w:t>
       </w:r>
     </w:p>
     <w:p>
@@ -5149,19 +4686,7 @@
         <w:rPr>
           <w:lang w:val="en-GB"/>
         </w:rPr>
-        <w:t xml:space="preserve">Circuit size </w:t>
-      </w:r>
-      <w:r>
-        <w:rPr>
-          <w:lang w:val="en-GB"/>
-        </w:rPr>
-        <w:t>-</w:t>
-      </w:r>
-      <w:r>
-        <w:rPr>
-          <w:lang w:val="en-GB"/>
-        </w:rPr>
-        <w:t xml:space="preserve"> proof size</w:t>
+        <w:t>Circuit size - proof size</w:t>
       </w:r>
     </w:p>
     <w:p>
@@ -5182,19 +4707,7 @@
         <w:rPr>
           <w:lang w:val="en-GB"/>
         </w:rPr>
-        <w:t xml:space="preserve">Circuit size </w:t>
-      </w:r>
-      <w:r>
-        <w:rPr>
-          <w:lang w:val="en-GB"/>
-        </w:rPr>
-        <w:t>-</w:t>
-      </w:r>
-      <w:r>
-        <w:rPr>
-          <w:lang w:val="en-GB"/>
-        </w:rPr>
-        <w:t xml:space="preserve"> verification time</w:t>
+        <w:t>Circuit size - verification time</w:t>
       </w:r>
     </w:p>
     <w:p>
@@ -5209,31 +4722,7 @@
         <w:rPr>
           <w:lang w:val="en-GB"/>
         </w:rPr>
-        <w:t>Because the four benchmark scenarios vary attribute count and predicate complexity jointly, they yield only four scenario-level observations</w:t>
-      </w:r>
-      <w:r>
-        <w:rPr>
-          <w:lang w:val="en-GB"/>
-        </w:rPr>
-        <w:t xml:space="preserve">; </w:t>
-      </w:r>
-      <w:r>
-        <w:rPr>
-          <w:lang w:val="en-GB"/>
-        </w:rPr>
-        <w:t xml:space="preserve">too few to support inferential correlation or regression. The five pairs above are therefore </w:t>
-      </w:r>
-      <w:r>
-        <w:rPr>
-          <w:lang w:val="en-GB"/>
-        </w:rPr>
-        <w:t>analysed</w:t>
-      </w:r>
-      <w:r>
-        <w:rPr>
-          <w:lang w:val="en-GB"/>
-        </w:rPr>
-        <w:t xml:space="preserve"> as descriptive scaling trends on scenario-level aggregates (n = 4), reported with their direction and shape but without inferential claims. Complementary run-level analysis within each scenario (N ≥ 30) is used to quantify variance and stability. If finer-grained scaling analysis is required, intermediate attribute counts (e.g., 1, 2, 4, 8, 12, 16) can be added in a follow-up phase.</w:t>
+        <w:t>Because the four benchmark scenarios vary attribute count and predicate complexity jointly, they yield only four scenario-level observations; too few to support inferential correlation or regression. The five pairs above are therefore analysed as descriptive scaling trends on scenario-level aggregates (n = 4), reported with their direction and shape but without inferential claims. Complementary run-level analysis within each scenario (N ≥ 30) is used to quantify variance and stability. If finer-grained scaling analysis is required, intermediate attribute counts (e.g., 1, 2, 4, 8, 12, 16) can be added in a follow-up phase.</w:t>
       </w:r>
     </w:p>
     <w:p>
@@ -5337,31 +4826,7 @@
         <w:rPr>
           <w:lang w:val="en-GB"/>
         </w:rPr>
-        <w:t>Because SMPC is engaged conceptually rather than implemented, the study's empirical results are interpreted against SMPC's known cost model</w:t>
-      </w:r>
-      <w:r>
-        <w:rPr>
-          <w:lang w:val="en-GB"/>
-        </w:rPr>
-        <w:t xml:space="preserve">: </w:t>
-      </w:r>
-      <w:r>
-        <w:rPr>
-          <w:lang w:val="en-GB"/>
-        </w:rPr>
-        <w:t>computation distributed across all participating nodes, with cost dominated by inter-party communication rounds rather than local proving</w:t>
-      </w:r>
-      <w:r>
-        <w:rPr>
-          <w:lang w:val="en-GB"/>
-        </w:rPr>
-        <w:t xml:space="preserve">, </w:t>
-      </w:r>
-      <w:r>
-        <w:rPr>
-          <w:lang w:val="en-GB"/>
-        </w:rPr>
-        <w:t>to articulate the conditions under which an SMPC-based architecture would be structurally preferable to the ZK-SNARK/Noir/Ethereum pipeline evaluated here (Objective 4 of Chapter One). This step is a reasoned, literature-grounded analysis of the empirical findings; it is not itself an experiment, and it is presented as such.</w:t>
+        <w:t>Because SMPC is engaged conceptually rather than implemented, the study's empirical results are interpreted against SMPC's known cost model: computation distributed across all participating nodes, with cost dominated by inter-party communication rounds rather than local proving, to articulate the conditions under which an SMPC-based architecture would be structurally preferable to the ZK-SNARK/Noir/Ethereum pipeline evaluated here (Objective 4 of Chapter One). This step is a reasoned, literature-grounded analysis of the empirical findings; it is not itself an experiment, and it is presented as such.</w:t>
       </w:r>
     </w:p>
     <w:p>
@@ -5379,34 +4844,7 @@
           <w:color w:val="000000"/>
           <w:lang w:val="en-GB"/>
         </w:rPr>
-        <w:t>3.11.</w:t>
-      </w:r>
-      <w:r>
-        <w:rPr>
-          <w:b/>
-          <w:bCs/>
-          <w:color w:val="000000"/>
-          <w:lang w:val="en-GB"/>
-        </w:rPr>
-        <w:t>6</w:t>
-      </w:r>
-      <w:r>
-        <w:rPr>
-          <w:b/>
-          <w:bCs/>
-          <w:color w:val="000000"/>
-          <w:lang w:val="en-GB"/>
-        </w:rPr>
-        <w:t xml:space="preserve"> Planned Data </w:t>
-      </w:r>
-      <w:r>
-        <w:rPr>
-          <w:b/>
-          <w:bCs/>
-          <w:color w:val="000000"/>
-          <w:lang w:val="en-GB"/>
-        </w:rPr>
-        <w:t>Visualizations</w:t>
+        <w:t>3.11.6 Planned Data Visualizations</w:t>
       </w:r>
     </w:p>
     <w:p>
@@ -5640,19 +5078,7 @@
         <w:rPr>
           <w:lang w:val="en-GB"/>
         </w:rPr>
-        <w:t>Reliability is enforced through repeated trial runs (N ≥ 30 per scenario), fixed host hardware, locked compiler and backend dependencies, automated benchmark execution, systematic logging, and formal failure tracking</w:t>
-      </w:r>
-      <w:r>
-        <w:rPr>
-          <w:lang w:val="en-GB"/>
-        </w:rPr>
-        <w:t xml:space="preserve"> and a pre-stage feasibility check before the full measurement protocol</w:t>
-      </w:r>
-      <w:r>
-        <w:rPr>
-          <w:lang w:val="en-GB"/>
-        </w:rPr>
-        <w:t>. The choice of at least thirty repetitions per scenario follows established guidance on statistically defensible performance benchmarking, which treats a small number of ad-hoc runs as insufficient grounds for drawing a reliable conclusion about system performance (Georges et al., 2007).</w:t>
+        <w:t>Reliability is enforced through repeated trial runs (N ≥ 30 per scenario), fixed host hardware, locked compiler and backend dependencies, automated benchmark execution, systematic logging, and formal failure tracking and a pre-stage feasibility check before the full measurement protocol. The choice of at least thirty repetitions per scenario follows established guidance on statistically defensible performance benchmarking, which treats a small number of ad-hoc runs as insufficient grounds for drawing a reliable conclusion about system performance (Georges et al., 2007).</w:t>
       </w:r>
     </w:p>
     <w:p>
@@ -5686,31 +5112,7 @@
         <w:rPr>
           <w:lang w:val="en-GB"/>
         </w:rPr>
-        <w:t>Internal validity is protected by holding the entire software stack</w:t>
-      </w:r>
-      <w:r>
-        <w:rPr>
-          <w:lang w:val="en-GB"/>
-        </w:rPr>
-        <w:t>,</w:t>
-      </w:r>
-      <w:r>
-        <w:rPr>
-          <w:lang w:val="en-GB"/>
-        </w:rPr>
-        <w:t xml:space="preserve"> Noir, Nargo, Barretenberg, and the Hardhat/Foundry toolchain</w:t>
-      </w:r>
-      <w:r>
-        <w:rPr>
-          <w:lang w:val="en-GB"/>
-        </w:rPr>
-        <w:t xml:space="preserve">, </w:t>
-      </w:r>
-      <w:r>
-        <w:rPr>
-          <w:lang w:val="en-GB"/>
-        </w:rPr>
-        <w:t>identical across every benchmark scenario, so that any observed difference in performance can be attributed to the deliberate variation in credential complexity rather than to an incidental change elsewhere in the pipeline (Wohlin et al., 2012).</w:t>
+        <w:t>Internal validity is protected by holding the entire software stack, Noir, Nargo, Barretenberg, and the Hardhat/Foundry toolchain, identical across every benchmark scenario, so that any observed difference in performance can be attributed to the deliberate variation in credential complexity rather than to an incidental change elsewhere in the pipeline (Wohlin et al., 2012).</w:t>
       </w:r>
     </w:p>
     <w:p>
@@ -5725,19 +5127,7 @@
         <w:rPr>
           <w:lang w:val="en-GB"/>
         </w:rPr>
-        <w:t xml:space="preserve">Construct validity is protected by measuring off-chain efficiency through execution time, peak RAM, and proof size, rather than through a proxy such as CPU </w:t>
-      </w:r>
-      <w:r>
-        <w:rPr>
-          <w:lang w:val="en-GB"/>
-        </w:rPr>
-        <w:t>utilization</w:t>
-      </w:r>
-      <w:r>
-        <w:rPr>
-          <w:lang w:val="en-GB"/>
-        </w:rPr>
-        <w:t xml:space="preserve"> alone, and by measuring on-chain efficiency through verification gas and calldata size, rather than through a market-dependent figure such as token price. Each measurement is chosen because it corresponds directly to the concept it is meant to capture, rather than to something merely correlated with it.</w:t>
+        <w:t>Construct validity is protected by measuring off-chain efficiency through execution time, peak RAM, and proof size, rather than through a proxy such as CPU utilization alone, and by measuring on-chain efficiency through verification gas and calldata size, rather than through a market-dependent figure such as token price. Each measurement is chosen because it corresponds directly to the concept it is meant to capture, rather than to something merely correlated with it.</w:t>
       </w:r>
     </w:p>
     <w:p>
@@ -5752,31 +5142,7 @@
         <w:rPr>
           <w:lang w:val="en-GB"/>
         </w:rPr>
-        <w:t>External validity is, by the nature of a controlled benchmark, bounded rather than universal. The findings reflect the designated software stack, circuit structure, proving backend, and hardware environment used in this study, and the conclusions apply specifically to the evaluated architecture under the controlled conditions described here</w:t>
-      </w:r>
-      <w:r>
-        <w:rPr>
-          <w:lang w:val="en-GB"/>
-        </w:rPr>
-        <w:t xml:space="preserve">, </w:t>
-      </w:r>
-      <w:r>
-        <w:rPr>
-          <w:lang w:val="en-GB"/>
-        </w:rPr>
-        <w:t xml:space="preserve">a limitation this study shares with every other empirical ZK benchmark reviewed in Chapter Two, none of which claims that its figures </w:t>
-      </w:r>
-      <w:r>
-        <w:rPr>
-          <w:lang w:val="en-GB"/>
-        </w:rPr>
-        <w:t>generalize</w:t>
-      </w:r>
-      <w:r>
-        <w:rPr>
-          <w:lang w:val="en-GB"/>
-        </w:rPr>
-        <w:t xml:space="preserve"> unconditionally to a different implementation (Guo et al., 2024).</w:t>
+        <w:t>External validity is, by the nature of a controlled benchmark, bounded rather than universal. The findings reflect the designated software stack, circuit structure, proving backend, and hardware environment used in this study, and the conclusions apply specifically to the evaluated architecture under the controlled conditions described here, a limitation this study shares with every other empirical ZK benchmark reviewed in Chapter Two, none of which claims that its figures generalize unconditionally to a different implementation (Guo et al., 2024).</w:t>
       </w:r>
     </w:p>
     <w:p>
@@ -6240,19 +5606,7 @@
         <w:rPr>
           <w:lang w:val="en-GB"/>
         </w:rPr>
-        <w:t xml:space="preserve">Taken together, these elements provide a reproducible structure for generating, </w:t>
-      </w:r>
-      <w:r>
-        <w:rPr>
-          <w:lang w:val="en-GB"/>
-        </w:rPr>
-        <w:t>analysing</w:t>
-      </w:r>
-      <w:r>
-        <w:rPr>
-          <w:lang w:val="en-GB"/>
-        </w:rPr>
-        <w:t>, and discussing empirical performance results, which Chapter Four will now put to use.</w:t>
+        <w:t>Taken together, these elements provide a reproducible structure for generating, analysing, and discussing empirical performance results, which Chapter Four will now put to use.</w:t>
       </w:r>
     </w:p>
     <w:p>
@@ -6431,31 +5785,7 @@
         <w:rPr>
           <w:lang w:val="en-GB"/>
         </w:rPr>
-        <w:t xml:space="preserve">Wood, G. (2024). Ethereum: A secure </w:t>
-      </w:r>
-      <w:r>
-        <w:rPr>
-          <w:lang w:val="en-GB"/>
-        </w:rPr>
-        <w:t>decentralized</w:t>
-      </w:r>
-      <w:r>
-        <w:rPr>
-          <w:lang w:val="en-GB"/>
-        </w:rPr>
-        <w:t xml:space="preserve"> </w:t>
-      </w:r>
-      <w:r>
-        <w:rPr>
-          <w:lang w:val="en-GB"/>
-        </w:rPr>
-        <w:t>generalized</w:t>
-      </w:r>
-      <w:r>
-        <w:rPr>
-          <w:lang w:val="en-GB"/>
-        </w:rPr>
-        <w:t xml:space="preserve"> transaction ledger (current EIP-based edition). Ethereum Foundation.</w:t>
+        <w:t>Wood, G. (2024). Ethereum: A secure decentralized generalized transaction ledger (current EIP-based edition). Ethereum Foundation.</w:t>
       </w:r>
     </w:p>
     <w:p>

</xml_diff>